<commit_message>
Add anticipated ledger postings and matter contact, calendar, and admin UI fixes.
Support anticipated ledger entries with approval permissions and updated ledger/accounts UI; let lawyers link to any matter contact for merge codes; fix calendar list layout, contact saves, precedents toolbar alignment, and folder creation copy.

Co-authored-by: Cursor <cursoragent@cursor.com>
</commit_message>
<xml_diff>
--- a/backend/scripts/Letterhead.docx
+++ b/backend/scripts/Letterhead.docx
@@ -29,14 +29,7 @@
           <w:highlight w:val="none"/>
         </w:rPr>
       </w:r>
-      <w:r>
-        <w:rPr>
-          <w:rFonts w:ascii="Droid Sans Mono" w:hAnsi="Droid Sans Mono" w:eastAsia="Droid Sans Mono" w:cs="Droid Sans Mono"/>
-          <w:color w:val="000000"/>
-          <w:sz w:val="19"/>
-          <w:highlight w:val="none"/>
-        </w:rPr>
-      </w:r>
+      <w:r/>
     </w:p>
     <w:p>
       <w:pPr>
@@ -55,7 +48,6 @@
           <w:highlight w:val="none"/>
         </w:rPr>
       </w:pPr>
-      <w:r/>
       <w:r>
         <w:rPr>
           <w:rFonts w:ascii="Droid Sans Mono" w:hAnsi="Droid Sans Mono" w:eastAsia="Droid Sans Mono" w:cs="Droid Sans Mono"/>
@@ -64,8 +56,15 @@
         </w:rPr>
         <w:t xml:space="preserve">[QUOTE_FEE_TABLE]</w:t>
       </w:r>
-      <w:r/>
-      <w:r/>
+      <w:r>
+        <w:rPr>
+          <w:rFonts w:ascii="Droid Sans Mono" w:hAnsi="Droid Sans Mono" w:eastAsia="Droid Sans Mono" w:cs="Droid Sans Mono"/>
+          <w:color w:val="000000"/>
+          <w:sz w:val="19"/>
+          <w:szCs w:val="19"/>
+          <w:highlight w:val="none"/>
+        </w:rPr>
+      </w:r>
     </w:p>
     <w:sectPr>
       <w:headerReference w:type="default" r:id="rId8"/>
@@ -156,75 +155,7 @@
       <w:ind w:right="0" w:firstLine="0" w:left="2551"/>
       <w:rPr/>
     </w:pPr>
-    <w:r>
-      <mc:AlternateContent>
-        <mc:Choice Requires="wpg">
-          <w:drawing>
-            <wp:inline xmlns:wp="http://schemas.openxmlformats.org/drawingml/2006/wordprocessingDrawing" distT="0" distB="0" distL="0" distR="0">
-              <wp:extent cx="2125507" cy="1278985"/>
-              <wp:effectExtent l="0" t="0" r="0" b="0"/>
-              <wp:docPr id="1" name=""/>
-              <wp:cNvGraphicFramePr>
-                <a:graphicFrameLocks xmlns:a="http://schemas.openxmlformats.org/drawingml/2006/main" noChangeAspect="1"/>
-              </wp:cNvGraphicFramePr>
-              <a:graphic xmlns:a="http://schemas.openxmlformats.org/drawingml/2006/main">
-                <a:graphicData uri="http://schemas.openxmlformats.org/drawingml/2006/picture">
-                  <pic:pic xmlns:pic="http://schemas.openxmlformats.org/drawingml/2006/picture">
-                    <pic:nvPicPr>
-                      <pic:cNvPr id="977487255" name=""/>
-                      <pic:cNvPicPr>
-                        <a:picLocks noChangeAspect="1"/>
-                      </pic:cNvPicPr>
-                      <pic:nvPr/>
-                    </pic:nvPicPr>
-                    <pic:blipFill rotWithShape="1">
-                      <a:blip r:embed="rId1"/>
-                      <a:stretch/>
-                    </pic:blipFill>
-                    <pic:spPr bwMode="auto">
-                      <a:xfrm flipH="0" flipV="0">
-                        <a:off x="0" y="0"/>
-                        <a:ext cx="2125507" cy="1278984"/>
-                      </a:xfrm>
-                      <a:prstGeom prst="rect">
-                        <a:avLst/>
-                      </a:prstGeom>
-                    </pic:spPr>
-                  </pic:pic>
-                </a:graphicData>
-              </a:graphic>
-            </wp:inline>
-          </w:drawing>
-        </mc:Choice>
-        <mc:Fallback>
-          <w:pict>
-            <v:shapetype id="_x0000_t75" coordsize="21600,21600" o:spt="75" o:preferrelative="t" path="m@4@5l@4@11@9@11@9@5xe" filled="f" stroked="f">
-              <v:stroke joinstyle="miter"/>
-              <v:formulas>
-                <v:f eqn="if lineDrawn pixelLineWidth 0"/>
-                <v:f eqn="sum @0 1 0"/>
-                <v:f eqn="sum 0 0 @1"/>
-                <v:f eqn="prod @2 1 2"/>
-                <v:f eqn="prod @3 21600 pixelWidth"/>
-                <v:f eqn="prod @3 21600 pixelHeight"/>
-                <v:f eqn="sum @0 0 1"/>
-                <v:f eqn="prod @6 1 2"/>
-                <v:f eqn="prod @7 21600 pixelWidth"/>
-                <v:f eqn="sum @8 21600 0"/>
-                <v:f eqn="prod @7 21600 pixelHeight"/>
-                <v:f eqn="sum @10 21600 0"/>
-              </v:formulas>
-              <v:path o:extrusionok="f" gradientshapeok="t" o:connecttype="rect"/>
-              <o:lock v:ext="edit" aspectratio="t"/>
-            </v:shapetype>
-            <v:shape id="_x0000_i0" o:spid="_x0000_s0" type="#_x0000_t75" style="width:167.36pt;height:100.71pt;mso-wrap-distance-left:0.00pt;mso-wrap-distance-top:0.00pt;mso-wrap-distance-right:0.00pt;mso-wrap-distance-bottom:0.00pt;z-index:1;" stroked="false">
-              <v:imagedata r:id="rId1" o:title=""/>
-              <o:lock v:ext="edit" rotation="t"/>
-            </v:shape>
-          </w:pict>
-        </mc:Fallback>
-      </mc:AlternateContent>
-    </w:r>
+    <w:r/>
     <w:r/>
   </w:p>
 </w:hdr>

</xml_diff>